<commit_message>
docs: brief en markdown para generar la propuesta y precio a S/ 6,500
- brief-propuesta-claude.md: brief autocontenido para regenerar la
  propuesta en Claude en cualquier formato (Word, artifact, slides, correo)
- Precio total S/ 6,500 diferenciado por fase: Fase 1 S/ 2,900 y
  Fase 2 S/ 3,600, cada una con desglose por componente
- Actualiza la propuesta en Word y el markdown al nuevo precio

Co-Authored-By: Claude Opus 5 <noreply@anthropic.com>
Claude-Session: https://claude.ai/code/session_01CJmBs8D3ifwuDFzYbKez5a
</commit_message>
<xml_diff>
--- a/docs/propuestas/Propuesta-SEM-SEO-AEO-GEO-Advance-Group.docx
+++ b/docs/propuestas/Propuesta-SEM-SEO-AEO-GEO-Advance-Group.docx
@@ -394,7 +394,7 @@
                 <w:sz w:val="19"/>
                 <w:szCs w:val="19"/>
               </w:rPr>
-              <w:t xml:space="preserve">S/ 4,500</w:t>
+              <w:t xml:space="preserve">S/ 6,500</w:t>
             </w:r>
             <w:r>
               <w:rPr>
@@ -2435,7 +2435,7 @@
                 <w:sz w:val="24"/>
                 <w:szCs w:val="24"/>
               </w:rPr>
-              <w:t xml:space="preserve">S/ 2,400</w:t>
+              <w:t xml:space="preserve">S/ 2,900</w:t>
             </w:r>
             <w:r>
               <w:rPr>
@@ -4947,7 +4947,7 @@
                 <w:sz w:val="24"/>
                 <w:szCs w:val="24"/>
               </w:rPr>
-              <w:t xml:space="preserve">S/ 2,100</w:t>
+              <w:t xml:space="preserve">S/ 3,600</w:t>
             </w:r>
             <w:r>
               <w:rPr>
@@ -7933,7 +7933,7 @@
                 <w:sz w:val="19"/>
                 <w:szCs w:val="19"/>
               </w:rPr>
-              <w:t xml:space="preserve">S/ 2,400</w:t>
+              <w:t xml:space="preserve">S/ 2,900</w:t>
             </w:r>
           </w:p>
         </w:tc>
@@ -8076,7 +8076,7 @@
                 <w:sz w:val="19"/>
                 <w:szCs w:val="19"/>
               </w:rPr>
-              <w:t xml:space="preserve">S/ 2,100</w:t>
+              <w:t xml:space="preserve">S/ 3,600</w:t>
             </w:r>
           </w:p>
         </w:tc>
@@ -8142,7 +8142,987 @@
                 <w:sz w:val="21"/>
                 <w:szCs w:val="21"/>
               </w:rPr>
-              <w:t xml:space="preserve">S/ 4,500</w:t>
+              <w:t xml:space="preserve">S/ 6,500</w:t>
+            </w:r>
+          </w:p>
+        </w:tc>
+      </w:tr>
+    </w:tbl>
+    <w:p>
+      <w:pPr>
+        <w:spacing w:after="240"/>
+      </w:pPr>
+    </w:p>
+    <w:p>
+      <w:pPr>
+        <w:pStyle w:val="Heading3"/>
+        <w:spacing w:after="90" w:before="280"/>
+      </w:pPr>
+      <w:r>
+        <w:rPr>
+          <w:rFonts w:ascii="Arial" w:cs="Arial" w:eastAsia="Arial" w:hAnsi="Arial"/>
+          <w:b/>
+          <w:bCs/>
+          <w:color w:val="001D3A"/>
+          <w:sz w:val="21"/>
+          <w:szCs w:val="21"/>
+        </w:rPr>
+        <w:t xml:space="preserve">Desglose de la Fase 1</w:t>
+      </w:r>
+    </w:p>
+    <w:tbl>
+      <w:tblPr>
+        <w:tblW w:type="dxa" w:w="9638"/>
+        <w:tblBorders>
+          <w:top w:val="single" w:color="D9DEE5" w:sz="4"/>
+          <w:left w:val="single" w:color="D9DEE5" w:sz="4"/>
+          <w:bottom w:val="single" w:color="D9DEE5" w:sz="4"/>
+          <w:right w:val="single" w:color="D9DEE5" w:sz="4"/>
+          <w:insideH w:val="single" w:color="D9DEE5" w:sz="4"/>
+          <w:insideV w:val="single" w:color="D9DEE5" w:sz="4"/>
+        </w:tblBorders>
+      </w:tblPr>
+      <w:tblGrid>
+        <w:gridCol w:w="6939"/>
+        <w:gridCol w:w="2699"/>
+      </w:tblGrid>
+      <w:tr>
+        <w:trPr>
+          <w:tblHeader/>
+        </w:trPr>
+        <w:tc>
+          <w:tcPr>
+            <w:tcW w:type="dxa" w:w="6939"/>
+            <w:shd w:fill="EAF0F6" w:color="auto" w:val="clear"/>
+            <w:tcMar>
+              <w:top w:type="dxa" w:w="90"/>
+              <w:left w:type="dxa" w:w="130"/>
+              <w:bottom w:type="dxa" w:w="90"/>
+              <w:right w:type="dxa" w:w="130"/>
+            </w:tcMar>
+            <w:vAlign w:val="top"/>
+          </w:tcPr>
+          <w:p>
+            <w:pPr>
+              <w:spacing w:after="20" w:before="20" w:line="270"/>
+              <w:jc w:val="left"/>
+            </w:pPr>
+            <w:r>
+              <w:rPr>
+                <w:rFonts w:ascii="Arial" w:cs="Arial" w:eastAsia="Arial" w:hAnsi="Arial"/>
+                <w:b/>
+                <w:bCs/>
+                <w:color w:val="001D3A"/>
+                <w:spacing w:val="20"/>
+                <w:sz w:val="16"/>
+                <w:szCs w:val="16"/>
+              </w:rPr>
+              <w:t xml:space="preserve">Componente</w:t>
+            </w:r>
+          </w:p>
+        </w:tc>
+        <w:tc>
+          <w:tcPr>
+            <w:tcW w:type="dxa" w:w="2699"/>
+            <w:shd w:fill="EAF0F6" w:color="auto" w:val="clear"/>
+            <w:tcMar>
+              <w:top w:type="dxa" w:w="90"/>
+              <w:left w:type="dxa" w:w="130"/>
+              <w:bottom w:type="dxa" w:w="90"/>
+              <w:right w:type="dxa" w:w="130"/>
+            </w:tcMar>
+            <w:vAlign w:val="top"/>
+          </w:tcPr>
+          <w:p>
+            <w:pPr>
+              <w:spacing w:after="20" w:before="20" w:line="270"/>
+              <w:jc w:val="right"/>
+            </w:pPr>
+            <w:r>
+              <w:rPr>
+                <w:rFonts w:ascii="Arial" w:cs="Arial" w:eastAsia="Arial" w:hAnsi="Arial"/>
+                <w:b/>
+                <w:bCs/>
+                <w:color w:val="001D3A"/>
+                <w:spacing w:val="20"/>
+                <w:sz w:val="16"/>
+                <w:szCs w:val="16"/>
+              </w:rPr>
+              <w:t xml:space="preserve">Inversión</w:t>
+            </w:r>
+          </w:p>
+        </w:tc>
+      </w:tr>
+      <w:tr>
+        <w:trPr>
+          <w:tblHeader w:val="false"/>
+        </w:trPr>
+        <w:tc>
+          <w:tcPr>
+            <w:tcW w:type="dxa" w:w="6939"/>
+            <w:tcMar>
+              <w:top w:type="dxa" w:w="90"/>
+              <w:left w:type="dxa" w:w="130"/>
+              <w:bottom w:type="dxa" w:w="90"/>
+              <w:right w:type="dxa" w:w="130"/>
+            </w:tcMar>
+            <w:vAlign w:val="top"/>
+          </w:tcPr>
+          <w:p>
+            <w:pPr>
+              <w:spacing w:after="20" w:before="20" w:line="270"/>
+              <w:jc w:val="left"/>
+            </w:pPr>
+            <w:r>
+              <w:rPr>
+                <w:rFonts w:ascii="Calibri" w:cs="Calibri" w:eastAsia="Calibri" w:hAnsi="Calibri"/>
+                <w:b w:val="false"/>
+                <w:bCs w:val="false"/>
+                <w:color w:val="4D5966"/>
+                <w:sz w:val="19"/>
+                <w:szCs w:val="19"/>
+              </w:rPr>
+              <w:t xml:space="preserve">Renderizado en servidor (prerender de 6 rutas públicas)</w:t>
+            </w:r>
+          </w:p>
+        </w:tc>
+        <w:tc>
+          <w:tcPr>
+            <w:tcW w:type="dxa" w:w="2699"/>
+            <w:tcMar>
+              <w:top w:type="dxa" w:w="90"/>
+              <w:left w:type="dxa" w:w="130"/>
+              <w:bottom w:type="dxa" w:w="90"/>
+              <w:right w:type="dxa" w:w="130"/>
+            </w:tcMar>
+            <w:vAlign w:val="top"/>
+          </w:tcPr>
+          <w:p>
+            <w:pPr>
+              <w:spacing w:after="20" w:before="20" w:line="270"/>
+              <w:jc w:val="right"/>
+            </w:pPr>
+            <w:r>
+              <w:rPr>
+                <w:rFonts w:ascii="Calibri" w:cs="Calibri" w:eastAsia="Calibri" w:hAnsi="Calibri"/>
+                <w:b w:val="false"/>
+                <w:bCs w:val="false"/>
+                <w:color w:val="4D5966"/>
+                <w:sz w:val="19"/>
+                <w:szCs w:val="19"/>
+              </w:rPr>
+              <w:t xml:space="preserve">S/ 1,000</w:t>
+            </w:r>
+          </w:p>
+        </w:tc>
+      </w:tr>
+      <w:tr>
+        <w:trPr>
+          <w:tblHeader w:val="false"/>
+        </w:trPr>
+        <w:tc>
+          <w:tcPr>
+            <w:tcW w:type="dxa" w:w="6939"/>
+            <w:shd w:fill="F4F7FA" w:color="auto" w:val="clear"/>
+            <w:tcMar>
+              <w:top w:type="dxa" w:w="90"/>
+              <w:left w:type="dxa" w:w="130"/>
+              <w:bottom w:type="dxa" w:w="90"/>
+              <w:right w:type="dxa" w:w="130"/>
+            </w:tcMar>
+            <w:vAlign w:val="top"/>
+          </w:tcPr>
+          <w:p>
+            <w:pPr>
+              <w:spacing w:after="20" w:before="20" w:line="270"/>
+              <w:jc w:val="left"/>
+            </w:pPr>
+            <w:r>
+              <w:rPr>
+                <w:rFonts w:ascii="Calibri" w:cs="Calibri" w:eastAsia="Calibri" w:hAnsi="Calibri"/>
+                <w:b w:val="false"/>
+                <w:bCs w:val="false"/>
+                <w:color w:val="4D5966"/>
+                <w:sz w:val="19"/>
+                <w:szCs w:val="19"/>
+              </w:rPr>
+              <w:t xml:space="preserve">SEO técnico on-page: metadatos, robots.txt, sitemap.xml y corrección del 404</w:t>
+            </w:r>
+          </w:p>
+        </w:tc>
+        <w:tc>
+          <w:tcPr>
+            <w:tcW w:type="dxa" w:w="2699"/>
+            <w:shd w:fill="F4F7FA" w:color="auto" w:val="clear"/>
+            <w:tcMar>
+              <w:top w:type="dxa" w:w="90"/>
+              <w:left w:type="dxa" w:w="130"/>
+              <w:bottom w:type="dxa" w:w="90"/>
+              <w:right w:type="dxa" w:w="130"/>
+            </w:tcMar>
+            <w:vAlign w:val="top"/>
+          </w:tcPr>
+          <w:p>
+            <w:pPr>
+              <w:spacing w:after="20" w:before="20" w:line="270"/>
+              <w:jc w:val="right"/>
+            </w:pPr>
+            <w:r>
+              <w:rPr>
+                <w:rFonts w:ascii="Calibri" w:cs="Calibri" w:eastAsia="Calibri" w:hAnsi="Calibri"/>
+                <w:b w:val="false"/>
+                <w:bCs w:val="false"/>
+                <w:color w:val="4D5966"/>
+                <w:sz w:val="19"/>
+                <w:szCs w:val="19"/>
+              </w:rPr>
+              <w:t xml:space="preserve">S/ 600</w:t>
+            </w:r>
+          </w:p>
+        </w:tc>
+      </w:tr>
+      <w:tr>
+        <w:trPr>
+          <w:tblHeader w:val="false"/>
+        </w:trPr>
+        <w:tc>
+          <w:tcPr>
+            <w:tcW w:type="dxa" w:w="6939"/>
+            <w:tcMar>
+              <w:top w:type="dxa" w:w="90"/>
+              <w:left w:type="dxa" w:w="130"/>
+              <w:bottom w:type="dxa" w:w="90"/>
+              <w:right w:type="dxa" w:w="130"/>
+            </w:tcMar>
+            <w:vAlign w:val="top"/>
+          </w:tcPr>
+          <w:p>
+            <w:pPr>
+              <w:spacing w:after="20" w:before="20" w:line="270"/>
+              <w:jc w:val="left"/>
+            </w:pPr>
+            <w:r>
+              <w:rPr>
+                <w:rFonts w:ascii="Calibri" w:cs="Calibri" w:eastAsia="Calibri" w:hAnsi="Calibri"/>
+                <w:b w:val="false"/>
+                <w:bCs w:val="false"/>
+                <w:color w:val="4D5966"/>
+                <w:sz w:val="19"/>
+                <w:szCs w:val="19"/>
+              </w:rPr>
+              <w:t xml:space="preserve">Datos estructurados JSON-LD y llms.txt</w:t>
+            </w:r>
+          </w:p>
+        </w:tc>
+        <w:tc>
+          <w:tcPr>
+            <w:tcW w:type="dxa" w:w="2699"/>
+            <w:tcMar>
+              <w:top w:type="dxa" w:w="90"/>
+              <w:left w:type="dxa" w:w="130"/>
+              <w:bottom w:type="dxa" w:w="90"/>
+              <w:right w:type="dxa" w:w="130"/>
+            </w:tcMar>
+            <w:vAlign w:val="top"/>
+          </w:tcPr>
+          <w:p>
+            <w:pPr>
+              <w:spacing w:after="20" w:before="20" w:line="270"/>
+              <w:jc w:val="right"/>
+            </w:pPr>
+            <w:r>
+              <w:rPr>
+                <w:rFonts w:ascii="Calibri" w:cs="Calibri" w:eastAsia="Calibri" w:hAnsi="Calibri"/>
+                <w:b w:val="false"/>
+                <w:bCs w:val="false"/>
+                <w:color w:val="4D5966"/>
+                <w:sz w:val="19"/>
+                <w:szCs w:val="19"/>
+              </w:rPr>
+              <w:t xml:space="preserve">S/ 500</w:t>
+            </w:r>
+          </w:p>
+        </w:tc>
+      </w:tr>
+      <w:tr>
+        <w:trPr>
+          <w:tblHeader w:val="false"/>
+        </w:trPr>
+        <w:tc>
+          <w:tcPr>
+            <w:tcW w:type="dxa" w:w="6939"/>
+            <w:shd w:fill="F4F7FA" w:color="auto" w:val="clear"/>
+            <w:tcMar>
+              <w:top w:type="dxa" w:w="90"/>
+              <w:left w:type="dxa" w:w="130"/>
+              <w:bottom w:type="dxa" w:w="90"/>
+              <w:right w:type="dxa" w:w="130"/>
+            </w:tcMar>
+            <w:vAlign w:val="top"/>
+          </w:tcPr>
+          <w:p>
+            <w:pPr>
+              <w:spacing w:after="20" w:before="20" w:line="270"/>
+              <w:jc w:val="left"/>
+            </w:pPr>
+            <w:r>
+              <w:rPr>
+                <w:rFonts w:ascii="Calibri" w:cs="Calibri" w:eastAsia="Calibri" w:hAnsi="Calibri"/>
+                <w:b w:val="false"/>
+                <w:bCs w:val="false"/>
+                <w:color w:val="4D5966"/>
+                <w:sz w:val="19"/>
+                <w:szCs w:val="19"/>
+              </w:rPr>
+              <w:t xml:space="preserve">Analítica y medición: GA4, Tag Manager, Search Console, Bing y Business Profile</w:t>
+            </w:r>
+          </w:p>
+        </w:tc>
+        <w:tc>
+          <w:tcPr>
+            <w:tcW w:type="dxa" w:w="2699"/>
+            <w:shd w:fill="F4F7FA" w:color="auto" w:val="clear"/>
+            <w:tcMar>
+              <w:top w:type="dxa" w:w="90"/>
+              <w:left w:type="dxa" w:w="130"/>
+              <w:bottom w:type="dxa" w:w="90"/>
+              <w:right w:type="dxa" w:w="130"/>
+            </w:tcMar>
+            <w:vAlign w:val="top"/>
+          </w:tcPr>
+          <w:p>
+            <w:pPr>
+              <w:spacing w:after="20" w:before="20" w:line="270"/>
+              <w:jc w:val="right"/>
+            </w:pPr>
+            <w:r>
+              <w:rPr>
+                <w:rFonts w:ascii="Calibri" w:cs="Calibri" w:eastAsia="Calibri" w:hAnsi="Calibri"/>
+                <w:b w:val="false"/>
+                <w:bCs w:val="false"/>
+                <w:color w:val="4D5966"/>
+                <w:sz w:val="19"/>
+                <w:szCs w:val="19"/>
+              </w:rPr>
+              <w:t xml:space="preserve">S/ 500</w:t>
+            </w:r>
+          </w:p>
+        </w:tc>
+      </w:tr>
+      <w:tr>
+        <w:trPr>
+          <w:tblHeader w:val="false"/>
+        </w:trPr>
+        <w:tc>
+          <w:tcPr>
+            <w:tcW w:type="dxa" w:w="6939"/>
+            <w:tcMar>
+              <w:top w:type="dxa" w:w="90"/>
+              <w:left w:type="dxa" w:w="130"/>
+              <w:bottom w:type="dxa" w:w="90"/>
+              <w:right w:type="dxa" w:w="130"/>
+            </w:tcMar>
+            <w:vAlign w:val="top"/>
+          </w:tcPr>
+          <w:p>
+            <w:pPr>
+              <w:spacing w:after="20" w:before="20" w:line="270"/>
+              <w:jc w:val="left"/>
+            </w:pPr>
+            <w:r>
+              <w:rPr>
+                <w:rFonts w:ascii="Calibri" w:cs="Calibri" w:eastAsia="Calibri" w:hAnsi="Calibri"/>
+                <w:b w:val="false"/>
+                <w:bCs w:val="false"/>
+                <w:color w:val="4D5966"/>
+                <w:sz w:val="19"/>
+                <w:szCs w:val="19"/>
+              </w:rPr>
+              <w:t xml:space="preserve">Core Web Vitals, QA, informe antes/después y sesión de traspaso</w:t>
+            </w:r>
+          </w:p>
+        </w:tc>
+        <w:tc>
+          <w:tcPr>
+            <w:tcW w:type="dxa" w:w="2699"/>
+            <w:tcMar>
+              <w:top w:type="dxa" w:w="90"/>
+              <w:left w:type="dxa" w:w="130"/>
+              <w:bottom w:type="dxa" w:w="90"/>
+              <w:right w:type="dxa" w:w="130"/>
+            </w:tcMar>
+            <w:vAlign w:val="top"/>
+          </w:tcPr>
+          <w:p>
+            <w:pPr>
+              <w:spacing w:after="20" w:before="20" w:line="270"/>
+              <w:jc w:val="right"/>
+            </w:pPr>
+            <w:r>
+              <w:rPr>
+                <w:rFonts w:ascii="Calibri" w:cs="Calibri" w:eastAsia="Calibri" w:hAnsi="Calibri"/>
+                <w:b w:val="false"/>
+                <w:bCs w:val="false"/>
+                <w:color w:val="4D5966"/>
+                <w:sz w:val="19"/>
+                <w:szCs w:val="19"/>
+              </w:rPr>
+              <w:t xml:space="preserve">S/ 300</w:t>
+            </w:r>
+          </w:p>
+        </w:tc>
+      </w:tr>
+      <w:tr>
+        <w:trPr>
+          <w:tblHeader w:val="false"/>
+        </w:trPr>
+        <w:tc>
+          <w:tcPr>
+            <w:tcW w:type="dxa" w:w="6939"/>
+            <w:shd w:fill="001D3A" w:color="auto" w:val="clear"/>
+            <w:tcMar>
+              <w:top w:type="dxa" w:w="90"/>
+              <w:left w:type="dxa" w:w="130"/>
+              <w:bottom w:type="dxa" w:w="90"/>
+              <w:right w:type="dxa" w:w="130"/>
+            </w:tcMar>
+            <w:vAlign w:val="top"/>
+          </w:tcPr>
+          <w:p>
+            <w:pPr>
+              <w:spacing w:after="20" w:before="20" w:line="270"/>
+              <w:jc w:val="left"/>
+            </w:pPr>
+            <w:r>
+              <w:rPr>
+                <w:rFonts w:ascii="Arial" w:cs="Arial" w:eastAsia="Arial" w:hAnsi="Arial"/>
+                <w:b/>
+                <w:bCs/>
+                <w:color w:val="FFFFFF"/>
+                <w:sz w:val="21"/>
+                <w:szCs w:val="21"/>
+              </w:rPr>
+              <w:t xml:space="preserve">SUBTOTAL FASE 1</w:t>
+            </w:r>
+          </w:p>
+        </w:tc>
+        <w:tc>
+          <w:tcPr>
+            <w:tcW w:type="dxa" w:w="2699"/>
+            <w:shd w:fill="001D3A" w:color="auto" w:val="clear"/>
+            <w:tcMar>
+              <w:top w:type="dxa" w:w="90"/>
+              <w:left w:type="dxa" w:w="130"/>
+              <w:bottom w:type="dxa" w:w="90"/>
+              <w:right w:type="dxa" w:w="130"/>
+            </w:tcMar>
+            <w:vAlign w:val="top"/>
+          </w:tcPr>
+          <w:p>
+            <w:pPr>
+              <w:spacing w:after="20" w:before="20" w:line="270"/>
+              <w:jc w:val="right"/>
+            </w:pPr>
+            <w:r>
+              <w:rPr>
+                <w:rFonts w:ascii="Arial" w:cs="Arial" w:eastAsia="Arial" w:hAnsi="Arial"/>
+                <w:b/>
+                <w:bCs/>
+                <w:color w:val="FFFFFF"/>
+                <w:sz w:val="21"/>
+                <w:szCs w:val="21"/>
+              </w:rPr>
+              <w:t xml:space="preserve">S/ 2,900</w:t>
+            </w:r>
+          </w:p>
+        </w:tc>
+      </w:tr>
+    </w:tbl>
+    <w:p>
+      <w:pPr>
+        <w:spacing w:after="240"/>
+      </w:pPr>
+    </w:p>
+    <w:p>
+      <w:pPr>
+        <w:pStyle w:val="Heading3"/>
+        <w:spacing w:after="90" w:before="280"/>
+      </w:pPr>
+      <w:r>
+        <w:rPr>
+          <w:rFonts w:ascii="Arial" w:cs="Arial" w:eastAsia="Arial" w:hAnsi="Arial"/>
+          <w:b/>
+          <w:bCs/>
+          <w:color w:val="001D3A"/>
+          <w:sz w:val="21"/>
+          <w:szCs w:val="21"/>
+        </w:rPr>
+        <w:t xml:space="preserve">Desglose de la Fase 2</w:t>
+      </w:r>
+    </w:p>
+    <w:tbl>
+      <w:tblPr>
+        <w:tblW w:type="dxa" w:w="9638"/>
+        <w:tblBorders>
+          <w:top w:val="single" w:color="D9DEE5" w:sz="4"/>
+          <w:left w:val="single" w:color="D9DEE5" w:sz="4"/>
+          <w:bottom w:val="single" w:color="D9DEE5" w:sz="4"/>
+          <w:right w:val="single" w:color="D9DEE5" w:sz="4"/>
+          <w:insideH w:val="single" w:color="D9DEE5" w:sz="4"/>
+          <w:insideV w:val="single" w:color="D9DEE5" w:sz="4"/>
+        </w:tblBorders>
+      </w:tblPr>
+      <w:tblGrid>
+        <w:gridCol w:w="6939"/>
+        <w:gridCol w:w="2699"/>
+      </w:tblGrid>
+      <w:tr>
+        <w:trPr>
+          <w:tblHeader/>
+        </w:trPr>
+        <w:tc>
+          <w:tcPr>
+            <w:tcW w:type="dxa" w:w="6939"/>
+            <w:shd w:fill="EAF0F6" w:color="auto" w:val="clear"/>
+            <w:tcMar>
+              <w:top w:type="dxa" w:w="90"/>
+              <w:left w:type="dxa" w:w="130"/>
+              <w:bottom w:type="dxa" w:w="90"/>
+              <w:right w:type="dxa" w:w="130"/>
+            </w:tcMar>
+            <w:vAlign w:val="top"/>
+          </w:tcPr>
+          <w:p>
+            <w:pPr>
+              <w:spacing w:after="20" w:before="20" w:line="270"/>
+              <w:jc w:val="left"/>
+            </w:pPr>
+            <w:r>
+              <w:rPr>
+                <w:rFonts w:ascii="Arial" w:cs="Arial" w:eastAsia="Arial" w:hAnsi="Arial"/>
+                <w:b/>
+                <w:bCs/>
+                <w:color w:val="001D3A"/>
+                <w:spacing w:val="20"/>
+                <w:sz w:val="16"/>
+                <w:szCs w:val="16"/>
+              </w:rPr>
+              <w:t xml:space="preserve">Componente</w:t>
+            </w:r>
+          </w:p>
+        </w:tc>
+        <w:tc>
+          <w:tcPr>
+            <w:tcW w:type="dxa" w:w="2699"/>
+            <w:shd w:fill="EAF0F6" w:color="auto" w:val="clear"/>
+            <w:tcMar>
+              <w:top w:type="dxa" w:w="90"/>
+              <w:left w:type="dxa" w:w="130"/>
+              <w:bottom w:type="dxa" w:w="90"/>
+              <w:right w:type="dxa" w:w="130"/>
+            </w:tcMar>
+            <w:vAlign w:val="top"/>
+          </w:tcPr>
+          <w:p>
+            <w:pPr>
+              <w:spacing w:after="20" w:before="20" w:line="270"/>
+              <w:jc w:val="right"/>
+            </w:pPr>
+            <w:r>
+              <w:rPr>
+                <w:rFonts w:ascii="Arial" w:cs="Arial" w:eastAsia="Arial" w:hAnsi="Arial"/>
+                <w:b/>
+                <w:bCs/>
+                <w:color w:val="001D3A"/>
+                <w:spacing w:val="20"/>
+                <w:sz w:val="16"/>
+                <w:szCs w:val="16"/>
+              </w:rPr>
+              <w:t xml:space="preserve">Inversión</w:t>
+            </w:r>
+          </w:p>
+        </w:tc>
+      </w:tr>
+      <w:tr>
+        <w:trPr>
+          <w:tblHeader w:val="false"/>
+        </w:trPr>
+        <w:tc>
+          <w:tcPr>
+            <w:tcW w:type="dxa" w:w="6939"/>
+            <w:tcMar>
+              <w:top w:type="dxa" w:w="90"/>
+              <w:left w:type="dxa" w:w="130"/>
+              <w:bottom w:type="dxa" w:w="90"/>
+              <w:right w:type="dxa" w:w="130"/>
+            </w:tcMar>
+            <w:vAlign w:val="top"/>
+          </w:tcPr>
+          <w:p>
+            <w:pPr>
+              <w:spacing w:after="20" w:before="20" w:line="270"/>
+              <w:jc w:val="left"/>
+            </w:pPr>
+            <w:r>
+              <w:rPr>
+                <w:rFonts w:ascii="Calibri" w:cs="Calibri" w:eastAsia="Calibri" w:hAnsi="Calibri"/>
+                <w:b w:val="false"/>
+                <w:bCs w:val="false"/>
+                <w:color w:val="4D5966"/>
+                <w:sz w:val="19"/>
+                <w:szCs w:val="19"/>
+              </w:rPr>
+              <w:t xml:space="preserve">Investigación, análisis de competencia y arquitectura de búsqueda</w:t>
+            </w:r>
+          </w:p>
+        </w:tc>
+        <w:tc>
+          <w:tcPr>
+            <w:tcW w:type="dxa" w:w="2699"/>
+            <w:tcMar>
+              <w:top w:type="dxa" w:w="90"/>
+              <w:left w:type="dxa" w:w="130"/>
+              <w:bottom w:type="dxa" w:w="90"/>
+              <w:right w:type="dxa" w:w="130"/>
+            </w:tcMar>
+            <w:vAlign w:val="top"/>
+          </w:tcPr>
+          <w:p>
+            <w:pPr>
+              <w:spacing w:after="20" w:before="20" w:line="270"/>
+              <w:jc w:val="right"/>
+            </w:pPr>
+            <w:r>
+              <w:rPr>
+                <w:rFonts w:ascii="Calibri" w:cs="Calibri" w:eastAsia="Calibri" w:hAnsi="Calibri"/>
+                <w:b w:val="false"/>
+                <w:bCs w:val="false"/>
+                <w:color w:val="4D5966"/>
+                <w:sz w:val="19"/>
+                <w:szCs w:val="19"/>
+              </w:rPr>
+              <w:t xml:space="preserve">S/ 550</w:t>
+            </w:r>
+          </w:p>
+        </w:tc>
+      </w:tr>
+      <w:tr>
+        <w:trPr>
+          <w:tblHeader w:val="false"/>
+        </w:trPr>
+        <w:tc>
+          <w:tcPr>
+            <w:tcW w:type="dxa" w:w="6939"/>
+            <w:shd w:fill="F4F7FA" w:color="auto" w:val="clear"/>
+            <w:tcMar>
+              <w:top w:type="dxa" w:w="90"/>
+              <w:left w:type="dxa" w:w="130"/>
+              <w:bottom w:type="dxa" w:w="90"/>
+              <w:right w:type="dxa" w:w="130"/>
+            </w:tcMar>
+            <w:vAlign w:val="top"/>
+          </w:tcPr>
+          <w:p>
+            <w:pPr>
+              <w:spacing w:after="20" w:before="20" w:line="270"/>
+              <w:jc w:val="left"/>
+            </w:pPr>
+            <w:r>
+              <w:rPr>
+                <w:rFonts w:ascii="Calibri" w:cs="Calibri" w:eastAsia="Calibri" w:hAnsi="Calibri"/>
+                <w:b w:val="false"/>
+                <w:bCs w:val="false"/>
+                <w:color w:val="4D5966"/>
+                <w:sz w:val="19"/>
+                <w:szCs w:val="19"/>
+              </w:rPr>
+              <w:t xml:space="preserve">Contenido SEO + AEO: 6 artículos, 2 landings optimizadas y preguntas frecuentes</w:t>
+            </w:r>
+          </w:p>
+        </w:tc>
+        <w:tc>
+          <w:tcPr>
+            <w:tcW w:type="dxa" w:w="2699"/>
+            <w:shd w:fill="F4F7FA" w:color="auto" w:val="clear"/>
+            <w:tcMar>
+              <w:top w:type="dxa" w:w="90"/>
+              <w:left w:type="dxa" w:w="130"/>
+              <w:bottom w:type="dxa" w:w="90"/>
+              <w:right w:type="dxa" w:w="130"/>
+            </w:tcMar>
+            <w:vAlign w:val="top"/>
+          </w:tcPr>
+          <w:p>
+            <w:pPr>
+              <w:spacing w:after="20" w:before="20" w:line="270"/>
+              <w:jc w:val="right"/>
+            </w:pPr>
+            <w:r>
+              <w:rPr>
+                <w:rFonts w:ascii="Calibri" w:cs="Calibri" w:eastAsia="Calibri" w:hAnsi="Calibri"/>
+                <w:b w:val="false"/>
+                <w:bCs w:val="false"/>
+                <w:color w:val="4D5966"/>
+                <w:sz w:val="19"/>
+                <w:szCs w:val="19"/>
+              </w:rPr>
+              <w:t xml:space="preserve">S/ 1,300</w:t>
+            </w:r>
+          </w:p>
+        </w:tc>
+      </w:tr>
+      <w:tr>
+        <w:trPr>
+          <w:tblHeader w:val="false"/>
+        </w:trPr>
+        <w:tc>
+          <w:tcPr>
+            <w:tcW w:type="dxa" w:w="6939"/>
+            <w:tcMar>
+              <w:top w:type="dxa" w:w="90"/>
+              <w:left w:type="dxa" w:w="130"/>
+              <w:bottom w:type="dxa" w:w="90"/>
+              <w:right w:type="dxa" w:w="130"/>
+            </w:tcMar>
+            <w:vAlign w:val="top"/>
+          </w:tcPr>
+          <w:p>
+            <w:pPr>
+              <w:spacing w:after="20" w:before="20" w:line="270"/>
+              <w:jc w:val="left"/>
+            </w:pPr>
+            <w:r>
+              <w:rPr>
+                <w:rFonts w:ascii="Calibri" w:cs="Calibri" w:eastAsia="Calibri" w:hAnsi="Calibri"/>
+                <w:b w:val="false"/>
+                <w:bCs w:val="false"/>
+                <w:color w:val="4D5966"/>
+                <w:sz w:val="19"/>
+                <w:szCs w:val="19"/>
+              </w:rPr>
+              <w:t xml:space="preserve">GEO: construcción de presencia y monitoreo de citaciones en IA</w:t>
+            </w:r>
+          </w:p>
+        </w:tc>
+        <w:tc>
+          <w:tcPr>
+            <w:tcW w:type="dxa" w:w="2699"/>
+            <w:tcMar>
+              <w:top w:type="dxa" w:w="90"/>
+              <w:left w:type="dxa" w:w="130"/>
+              <w:bottom w:type="dxa" w:w="90"/>
+              <w:right w:type="dxa" w:w="130"/>
+            </w:tcMar>
+            <w:vAlign w:val="top"/>
+          </w:tcPr>
+          <w:p>
+            <w:pPr>
+              <w:spacing w:after="20" w:before="20" w:line="270"/>
+              <w:jc w:val="right"/>
+            </w:pPr>
+            <w:r>
+              <w:rPr>
+                <w:rFonts w:ascii="Calibri" w:cs="Calibri" w:eastAsia="Calibri" w:hAnsi="Calibri"/>
+                <w:b w:val="false"/>
+                <w:bCs w:val="false"/>
+                <w:color w:val="4D5966"/>
+                <w:sz w:val="19"/>
+                <w:szCs w:val="19"/>
+              </w:rPr>
+              <w:t xml:space="preserve">S/ 550</w:t>
+            </w:r>
+          </w:p>
+        </w:tc>
+      </w:tr>
+      <w:tr>
+        <w:trPr>
+          <w:tblHeader w:val="false"/>
+        </w:trPr>
+        <w:tc>
+          <w:tcPr>
+            <w:tcW w:type="dxa" w:w="6939"/>
+            <w:shd w:fill="F4F7FA" w:color="auto" w:val="clear"/>
+            <w:tcMar>
+              <w:top w:type="dxa" w:w="90"/>
+              <w:left w:type="dxa" w:w="130"/>
+              <w:bottom w:type="dxa" w:w="90"/>
+              <w:right w:type="dxa" w:w="130"/>
+            </w:tcMar>
+            <w:vAlign w:val="top"/>
+          </w:tcPr>
+          <w:p>
+            <w:pPr>
+              <w:spacing w:after="20" w:before="20" w:line="270"/>
+              <w:jc w:val="left"/>
+            </w:pPr>
+            <w:r>
+              <w:rPr>
+                <w:rFonts w:ascii="Calibri" w:cs="Calibri" w:eastAsia="Calibri" w:hAnsi="Calibri"/>
+                <w:b w:val="false"/>
+                <w:bCs w:val="false"/>
+                <w:color w:val="4D5966"/>
+                <w:sz w:val="19"/>
+                <w:szCs w:val="19"/>
+              </w:rPr>
+              <w:t xml:space="preserve">SEM: construcción y gestión de Google Ads durante las 8 semanas</w:t>
+            </w:r>
+          </w:p>
+        </w:tc>
+        <w:tc>
+          <w:tcPr>
+            <w:tcW w:type="dxa" w:w="2699"/>
+            <w:shd w:fill="F4F7FA" w:color="auto" w:val="clear"/>
+            <w:tcMar>
+              <w:top w:type="dxa" w:w="90"/>
+              <w:left w:type="dxa" w:w="130"/>
+              <w:bottom w:type="dxa" w:w="90"/>
+              <w:right w:type="dxa" w:w="130"/>
+            </w:tcMar>
+            <w:vAlign w:val="top"/>
+          </w:tcPr>
+          <w:p>
+            <w:pPr>
+              <w:spacing w:after="20" w:before="20" w:line="270"/>
+              <w:jc w:val="right"/>
+            </w:pPr>
+            <w:r>
+              <w:rPr>
+                <w:rFonts w:ascii="Calibri" w:cs="Calibri" w:eastAsia="Calibri" w:hAnsi="Calibri"/>
+                <w:b w:val="false"/>
+                <w:bCs w:val="false"/>
+                <w:color w:val="4D5966"/>
+                <w:sz w:val="19"/>
+                <w:szCs w:val="19"/>
+              </w:rPr>
+              <w:t xml:space="preserve">S/ 800</w:t>
+            </w:r>
+          </w:p>
+        </w:tc>
+      </w:tr>
+      <w:tr>
+        <w:trPr>
+          <w:tblHeader w:val="false"/>
+        </w:trPr>
+        <w:tc>
+          <w:tcPr>
+            <w:tcW w:type="dxa" w:w="6939"/>
+            <w:tcMar>
+              <w:top w:type="dxa" w:w="90"/>
+              <w:left w:type="dxa" w:w="130"/>
+              <w:bottom w:type="dxa" w:w="90"/>
+              <w:right w:type="dxa" w:w="130"/>
+            </w:tcMar>
+            <w:vAlign w:val="top"/>
+          </w:tcPr>
+          <w:p>
+            <w:pPr>
+              <w:spacing w:after="20" w:before="20" w:line="270"/>
+              <w:jc w:val="left"/>
+            </w:pPr>
+            <w:r>
+              <w:rPr>
+                <w:rFonts w:ascii="Calibri" w:cs="Calibri" w:eastAsia="Calibri" w:hAnsi="Calibri"/>
+                <w:b w:val="false"/>
+                <w:bCs w:val="false"/>
+                <w:color w:val="4D5966"/>
+                <w:sz w:val="19"/>
+                <w:szCs w:val="19"/>
+              </w:rPr>
+              <w:t xml:space="preserve">Dashboard, 2 reportes mensuales y manual de operación</w:t>
+            </w:r>
+          </w:p>
+        </w:tc>
+        <w:tc>
+          <w:tcPr>
+            <w:tcW w:type="dxa" w:w="2699"/>
+            <w:tcMar>
+              <w:top w:type="dxa" w:w="90"/>
+              <w:left w:type="dxa" w:w="130"/>
+              <w:bottom w:type="dxa" w:w="90"/>
+              <w:right w:type="dxa" w:w="130"/>
+            </w:tcMar>
+            <w:vAlign w:val="top"/>
+          </w:tcPr>
+          <w:p>
+            <w:pPr>
+              <w:spacing w:after="20" w:before="20" w:line="270"/>
+              <w:jc w:val="right"/>
+            </w:pPr>
+            <w:r>
+              <w:rPr>
+                <w:rFonts w:ascii="Calibri" w:cs="Calibri" w:eastAsia="Calibri" w:hAnsi="Calibri"/>
+                <w:b w:val="false"/>
+                <w:bCs w:val="false"/>
+                <w:color w:val="4D5966"/>
+                <w:sz w:val="19"/>
+                <w:szCs w:val="19"/>
+              </w:rPr>
+              <w:t xml:space="preserve">S/ 400</w:t>
+            </w:r>
+          </w:p>
+        </w:tc>
+      </w:tr>
+      <w:tr>
+        <w:trPr>
+          <w:tblHeader w:val="false"/>
+        </w:trPr>
+        <w:tc>
+          <w:tcPr>
+            <w:tcW w:type="dxa" w:w="6939"/>
+            <w:shd w:fill="001D3A" w:color="auto" w:val="clear"/>
+            <w:tcMar>
+              <w:top w:type="dxa" w:w="90"/>
+              <w:left w:type="dxa" w:w="130"/>
+              <w:bottom w:type="dxa" w:w="90"/>
+              <w:right w:type="dxa" w:w="130"/>
+            </w:tcMar>
+            <w:vAlign w:val="top"/>
+          </w:tcPr>
+          <w:p>
+            <w:pPr>
+              <w:spacing w:after="20" w:before="20" w:line="270"/>
+              <w:jc w:val="left"/>
+            </w:pPr>
+            <w:r>
+              <w:rPr>
+                <w:rFonts w:ascii="Arial" w:cs="Arial" w:eastAsia="Arial" w:hAnsi="Arial"/>
+                <w:b/>
+                <w:bCs/>
+                <w:color w:val="FFFFFF"/>
+                <w:sz w:val="21"/>
+                <w:szCs w:val="21"/>
+              </w:rPr>
+              <w:t xml:space="preserve">SUBTOTAL FASE 2</w:t>
+            </w:r>
+          </w:p>
+        </w:tc>
+        <w:tc>
+          <w:tcPr>
+            <w:tcW w:type="dxa" w:w="2699"/>
+            <w:shd w:fill="001D3A" w:color="auto" w:val="clear"/>
+            <w:tcMar>
+              <w:top w:type="dxa" w:w="90"/>
+              <w:left w:type="dxa" w:w="130"/>
+              <w:bottom w:type="dxa" w:w="90"/>
+              <w:right w:type="dxa" w:w="130"/>
+            </w:tcMar>
+            <w:vAlign w:val="top"/>
+          </w:tcPr>
+          <w:p>
+            <w:pPr>
+              <w:spacing w:after="20" w:before="20" w:line="270"/>
+              <w:jc w:val="right"/>
+            </w:pPr>
+            <w:r>
+              <w:rPr>
+                <w:rFonts w:ascii="Arial" w:cs="Arial" w:eastAsia="Arial" w:hAnsi="Arial"/>
+                <w:b/>
+                <w:bCs/>
+                <w:color w:val="FFFFFF"/>
+                <w:sz w:val="21"/>
+                <w:szCs w:val="21"/>
+              </w:rPr>
+              <w:t xml:space="preserve">S/ 3,600</w:t>
             </w:r>
           </w:p>
         </w:tc>
@@ -8151,6 +9131,55 @@
     <w:p>
       <w:pPr>
         <w:spacing w:after="200"/>
+      </w:pPr>
+    </w:p>
+    <w:p>
+      <w:pPr>
+        <w:spacing w:after="140" w:before="0" w:line="290"/>
+      </w:pPr>
+      <w:r>
+        <w:rPr>
+          <w:rFonts w:ascii="Calibri" w:cs="Calibri" w:eastAsia="Calibri" w:hAnsi="Calibri"/>
+          <w:b w:val="false"/>
+          <w:bCs w:val="false"/>
+          <w:i w:val="false"/>
+          <w:iCs w:val="false"/>
+          <w:color w:val="4D5966"/>
+          <w:sz w:val="21"/>
+          <w:szCs w:val="21"/>
+        </w:rPr>
+        <w:t xml:space="preserve"/>
+      </w:r>
+      <w:r>
+        <w:rPr>
+          <w:rFonts w:ascii="Calibri" w:cs="Calibri" w:eastAsia="Calibri" w:hAnsi="Calibri"/>
+          <w:b/>
+          <w:bCs/>
+          <w:i w:val="false"/>
+          <w:iCs w:val="false"/>
+          <w:color w:val="4D5966"/>
+          <w:sz w:val="21"/>
+          <w:szCs w:val="21"/>
+        </w:rPr>
+        <w:t xml:space="preserve">Las fases son contratables por separado.</w:t>
+      </w:r>
+      <w:r>
+        <w:rPr>
+          <w:rFonts w:ascii="Calibri" w:cs="Calibri" w:eastAsia="Calibri" w:hAnsi="Calibri"/>
+          <w:b w:val="false"/>
+          <w:bCs w:val="false"/>
+          <w:i w:val="false"/>
+          <w:iCs w:val="false"/>
+          <w:color w:val="4D5966"/>
+          <w:sz w:val="21"/>
+          <w:szCs w:val="21"/>
+        </w:rPr>
+        <w:t xml:space="preserve"> La Fase 2 solo tiene sentido con la Fase 1 ejecutada; la Fase 1 tiene valor propio aunque la Fase 2 no se contrate.</w:t>
+      </w:r>
+    </w:p>
+    <w:p>
+      <w:pPr>
+        <w:spacing w:after="160"/>
       </w:pPr>
     </w:p>
     <w:tbl>

</xml_diff>